<commit_message>
feat(roles): xoa vai tro phong_gd theo chinh quyen dia phuong 2 cap (CR-017)
Can cu: ND 142/2025, TT 13&15/2025/TT-BGDDT - Phong GD&DT cap huyen
bai bo tu 1/7/2025; chuyen mon -> So GD&DT, hanh chinh/dia ban ->
UBND cap xa (Phong VHXH).

- Code: bo phong_gd khoi Role, ROLE_HOME, STAFF_ROLES, nav,
  requireRoles dept/*, dept-brief, login demo list
- DB: scn_is_dept() bo 'phong_gd'; profiles_role_check cap nhat;
  xoa profile + auth user phonggd@demo.scn; reparent UBND -> So,
  xoa org_unit loai 'phong'
- Tests: qa-full-coverage + qa-e2e bo phong_gd khoi matrix
- Docs: ROLE-MATRIX, user guide, MO-TA-CHUC-NANG, PPTX/DOCX regen
- CR doc: docs/project/CR-017-remove-phong-gd.md

Generated with [Devin](https://devin.ai)

Co-Authored-By: Devin <158243242+devin-ai-integration[bot]@users.noreply.github.com>
</commit_message>
<xml_diff>
--- a/docs/user-guide/SO-CHU-NHIEM-SO-TAI-LIEU.docx
+++ b/docs/user-guide/SO-CHU-NHIEM-SO-TAI-LIEU.docx
@@ -518,7 +518,7 @@
               <w:rPr>
                 <w:sz w:val="18"/>
               </w:rPr>
-              <w:t>Phòng GD&amp;ĐT / UBND</w:t>
+              <w:t>UBND cấp xã</w:t>
             </w:r>
           </w:p>
         </w:tc>
@@ -531,7 +531,7 @@
               <w:rPr>
                 <w:sz w:val="18"/>
               </w:rPr>
-              <w:t>phonggd@demo.scn, ubnd@demo.scn</w:t>
+              <w:t>ubnd@demo.scn</w:t>
             </w:r>
           </w:p>
         </w:tc>
@@ -4213,7 +4213,7 @@
     </w:p>
     <w:p>
       <w:r>
-        <w:t>Phiên bản: 1.0 · Ngày: 21/09/2026</w:t>
+        <w:t>Phiên bản: 1.1 · Ngày: 23/09/2026</w:t>
       </w:r>
     </w:p>
     <w:p>
@@ -7300,7 +7300,7 @@
         <w:pStyle w:val="Heading2"/>
       </w:pPr>
       <w:r>
-        <w:t>6. Sở GD&amp;ĐT / Phòng GD&amp;ĐT / UBND</w:t>
+        <w:t>6. Sở GD&amp;ĐT / UBND cấp xã</w:t>
       </w:r>
     </w:p>
     <w:p>
@@ -7311,7 +7311,7 @@
         <w:rPr>
           <w:b/>
         </w:rPr>
-        <w:t>Dashboard cấp Sở/Phòng/địa bàn</w:t>
+        <w:t>Dashboard cấp Sở/địa bàn UBND xã</w:t>
       </w:r>
       <w:r>
         <w:t xml:space="preserve">: tổng hợp các trường - quy mô, tỷ lệ chuyên cần, sự cố, cảnh báo; nút </w:t>
@@ -7323,7 +7323,7 @@
         <w:t>AI bản tin</w:t>
       </w:r>
       <w:r>
-        <w:t xml:space="preserve"> tổng hợp.</w:t>
+        <w:t xml:space="preserve"> tổng hợp. (Theo chính quyền địa phương 2 cấp - Phòng GD&amp;ĐT cấp huyện đã bãi bỏ từ 1/7/2025.)</w:t>
       </w:r>
     </w:p>
     <w:p>

</xml_diff>